<commit_message>
feat(resume): clarify systems engineering positioning
</commit_message>
<xml_diff>
--- a/Mohamad_Firdaus_Resume_2026.docx
+++ b/Mohamad_Firdaus_Resume_2026.docx
@@ -31,7 +31,7 @@
           <w:sz w:val="20"/>
           <w:szCs w:val="20"/>
         </w:rPr>
-        <w:t xml:space="preserve">Senior Software Engineer — ERP/MES, Manufacturing Systems, C#/.NET, Python and Full-Stack Delivery</w:t>
+        <w:t xml:space="preserve">Senior Software Engineer | ERP/MES &amp; Manufacturing Systems | C#/.NET, Python, Full-Stack</w:t>
       </w:r>
     </w:p>
     <w:p>
@@ -78,7 +78,7 @@
           <w:sz w:val="18"/>
           <w:szCs w:val="18"/>
         </w:rPr>
-        <w:t xml:space="preserve">Self-taught software engineer with 15+ years across enterprise systems, ERP/MES, e-commerce, education and workflow automation. Architected and built a production ERP replacing SAP/Navision for refinery operations, including manufacturing execution, supply chain, finance, HR and procurement. Strongest evidence is in C#/.NET foundations, Nuxt/Vue/TypeScript, Python, SQL and end-to-end delivery from requirements through support.</w:t>
+        <w:t xml:space="preserve">Senior software engineer with 15+ years across enterprise systems, ERP/MES, e-commerce, education and workflow automation. Architected and built a production ERP replacing SAP/Navision for refinery operations across manufacturing execution, supply chain, finance, HR and procurement. Strongest evidence is end-to-end delivery across requirements, architecture, C#/.NET foundations, Nuxt/Vue/TypeScript, Python, SQL, testing and supportability.</w:t>
       </w:r>
     </w:p>
     <w:p>
@@ -235,7 +235,7 @@
           <w:sz w:val="17"/>
           <w:szCs w:val="17"/>
         </w:rPr>
-        <w:t xml:space="preserve">Delivered mission-critical production software for a confidential refinery client; downtime represented real operational risk.</w:t>
+        <w:t xml:space="preserve">Designed the system around operational continuity, data integrity and support after release.</w:t>
       </w:r>
     </w:p>
     <w:p>

</xml_diff>

<commit_message>
feat(web-profile): publish conversion and resume refresh
</commit_message>
<xml_diff>
--- a/Mohamad_Firdaus_Resume_2026.docx
+++ b/Mohamad_Firdaus_Resume_2026.docx
@@ -31,7 +31,7 @@
           <w:sz w:val="20"/>
           <w:szCs w:val="20"/>
         </w:rPr>
-        <w:t xml:space="preserve">Senior Software Engineer — ERP/MES, Manufacturing Systems, C#/.NET, Python and Full-Stack Delivery</w:t>
+        <w:t xml:space="preserve">Senior Software Engineer | ERP/MES &amp; Manufacturing Systems | C#/.NET, Python, Full-Stack</w:t>
       </w:r>
     </w:p>
     <w:p>
@@ -78,7 +78,7 @@
           <w:sz w:val="18"/>
           <w:szCs w:val="18"/>
         </w:rPr>
-        <w:t xml:space="preserve">Self-taught software engineer with 15+ years across enterprise systems, ERP/MES, e-commerce, education and workflow automation. Architected and built a production ERP replacing SAP/Navision for refinery operations, including manufacturing execution, supply chain, finance, HR and procurement. Strongest evidence is in C#/.NET foundations, Nuxt/Vue/TypeScript, Python, SQL and end-to-end delivery from requirements through support.</w:t>
+        <w:t xml:space="preserve">Senior software engineer with 15+ years across enterprise systems, ERP/MES, e-commerce, education and workflow automation. Architected and built a production ERP replacing SAP/Navision for refinery operations across manufacturing execution, supply chain, finance, HR and procurement. Strongest evidence is end-to-end delivery across requirements, architecture, C#/.NET foundations, Nuxt/Vue/TypeScript, Python, SQL, testing and supportability.</w:t>
       </w:r>
     </w:p>
     <w:p>
@@ -235,7 +235,7 @@
           <w:sz w:val="17"/>
           <w:szCs w:val="17"/>
         </w:rPr>
-        <w:t xml:space="preserve">Delivered mission-critical production software for a confidential refinery client; downtime represented real operational risk.</w:t>
+        <w:t xml:space="preserve">Designed the system around operational continuity, data integrity and support after release.</w:t>
       </w:r>
     </w:p>
     <w:p>

</xml_diff>